<commit_message>
docs: enrich Word document with file-by-file breakdown of manager views package
</commit_message>
<xml_diff>
--- a/PERFORMAX_Tech_Manager_Security_and_Postman_Verification.docx
+++ b/PERFORMAX_Tech_Manager_Security_and_Postman_Verification.docx
@@ -1184,6 +1184,749 @@
       <w:pPr>
         <w:spacing w:after="80"/>
       </w:pPr>
+    </w:p>
+    <w:p>
+      <w:pPr>
+        <w:keepNext/>
+        <w:spacing w:before="280" w:after="80"/>
+      </w:pPr>
+      <w:r>
+        <w:rPr>
+          <w:rFonts w:ascii="Calibri" w:hAnsi="Calibri"/>
+          <w:b/>
+          <w:color w:val="2B6CB0"/>
+          <w:sz w:val="26"/>
+        </w:rPr>
+        <w:t>File-by-File Architecture of the Sorted Package</w:t>
+      </w:r>
+    </w:p>
+    <w:p>
+      <w:pPr>
+        <w:spacing w:before="0" w:after="80" w:line="276" w:lineRule="auto"/>
+      </w:pPr>
+      <w:r>
+        <w:rPr>
+          <w:rFonts w:ascii="Calibri" w:hAnsi="Calibri"/>
+          <w:color w:val="2D3748"/>
+          <w:sz w:val="21"/>
+        </w:rPr>
+        <w:t>Each functionality is modularized into its own dedicated Python file to maintain strict single-responsibility, prevent merge conflicts, and ensure isolated security boundaries:</w:t>
+      </w:r>
+    </w:p>
+    <w:p>
+      <w:pPr>
+        <w:keepNext/>
+        <w:spacing w:before="200" w:after="40"/>
+      </w:pPr>
+      <w:r>
+        <w:rPr>
+          <w:rFonts w:ascii="Calibri" w:hAnsi="Calibri"/>
+          <w:b/>
+          <w:color w:val="1A365D"/>
+          <w:sz w:val="23"/>
+        </w:rPr>
+        <w:t>1. base.py — Core Security Guards &amp; Scope Isolation</w:t>
+      </w:r>
+    </w:p>
+    <w:p>
+      <w:pPr>
+        <w:spacing w:before="0" w:after="40" w:line="276" w:lineRule="auto"/>
+      </w:pPr>
+      <w:r>
+        <w:rPr>
+          <w:rFonts w:ascii="Calibri" w:hAnsi="Calibri"/>
+          <w:b/>
+          <w:color w:val="2D3748"/>
+          <w:sz w:val="21"/>
+        </w:rPr>
+        <w:t xml:space="preserve">Signature / Endpoint: </w:t>
+      </w:r>
+      <w:r>
+        <w:rPr>
+          <w:rFonts w:ascii="Calibri" w:hAnsi="Calibri"/>
+          <w:color w:val="2D3748"/>
+          <w:sz w:val="21"/>
+        </w:rPr>
+        <w:t>apps.manager.views.base</w:t>
+      </w:r>
+    </w:p>
+    <w:p>
+      <w:pPr>
+        <w:spacing w:before="0" w:after="120" w:line="276" w:lineRule="auto"/>
+      </w:pPr>
+      <w:r>
+        <w:rPr>
+          <w:rFonts w:ascii="Calibri" w:hAnsi="Calibri"/>
+          <w:b/>
+          <w:color w:val="2D3748"/>
+          <w:sz w:val="21"/>
+        </w:rPr>
+        <w:t xml:space="preserve">Implementation Details: </w:t>
+      </w:r>
+      <w:r>
+        <w:rPr>
+          <w:rFonts w:ascii="Calibri" w:hAnsi="Calibri"/>
+          <w:color w:val="2D3748"/>
+          <w:sz w:val="21"/>
+        </w:rPr>
+        <w:t>Contains the foundational security primitives shared across all manager controllers:</w:t>
+        <w:br/>
+        <w:t>• IsManagerUser: Custom DRF BasePermission that ensures request.user is authenticated and has role MANAGER, HR, or SUPER_ADMIN (or Django superuser/staff). Unauthenticated calls fail with HTTP 401; unauthorized roles fail with HTTP 403.</w:t>
+        <w:br/>
+        <w:t>• get_manager_reports_qs(user): Scopes database queries so Managers only see employees where Q(manager=user) | Q(user=user). HR and Super Admin users receive global organizational querysets.</w:t>
+        <w:br/>
+        <w:t>• Verified by Postman: SEC-01 (Anonymous 401) and SEC-02 through SEC-07 (Intern 403).</w:t>
+      </w:r>
+    </w:p>
+    <w:p>
+      <w:pPr>
+        <w:keepNext/>
+        <w:spacing w:before="200" w:after="40"/>
+      </w:pPr>
+      <w:r>
+        <w:rPr>
+          <w:rFonts w:ascii="Calibri" w:hAnsi="Calibri"/>
+          <w:b/>
+          <w:color w:val="1A365D"/>
+          <w:sz w:val="23"/>
+        </w:rPr>
+        <w:t>2. mentees_views.py — [M-01] Assigned Mentees Roster</w:t>
+      </w:r>
+    </w:p>
+    <w:p>
+      <w:pPr>
+        <w:spacing w:before="0" w:after="40" w:line="276" w:lineRule="auto"/>
+      </w:pPr>
+      <w:r>
+        <w:rPr>
+          <w:rFonts w:ascii="Calibri" w:hAnsi="Calibri"/>
+          <w:b/>
+          <w:color w:val="2D3748"/>
+          <w:sz w:val="21"/>
+        </w:rPr>
+        <w:t xml:space="preserve">Signature / Endpoint: </w:t>
+      </w:r>
+      <w:r>
+        <w:rPr>
+          <w:rFonts w:ascii="Calibri" w:hAnsi="Calibri"/>
+          <w:color w:val="2D3748"/>
+          <w:sz w:val="21"/>
+        </w:rPr>
+        <w:t>ManagerMenteesView | GET /api/v1/manager/mentees/ &amp; /api/v1/manager/interns/</w:t>
+      </w:r>
+    </w:p>
+    <w:p>
+      <w:pPr>
+        <w:spacing w:before="0" w:after="120" w:line="276" w:lineRule="auto"/>
+      </w:pPr>
+      <w:r>
+        <w:rPr>
+          <w:rFonts w:ascii="Calibri" w:hAnsi="Calibri"/>
+          <w:b/>
+          <w:color w:val="2D3748"/>
+          <w:sz w:val="21"/>
+        </w:rPr>
+        <w:t xml:space="preserve">Implementation Details: </w:t>
+      </w:r>
+      <w:r>
+        <w:rPr>
+          <w:rFonts w:ascii="Calibri" w:hAnsi="Calibri"/>
+          <w:color w:val="2D3748"/>
+          <w:sz w:val="21"/>
+        </w:rPr>
+        <w:t>Fetches and formats the list of interns/employees reporting to the manager:</w:t>
+        <w:br/>
+        <w:t>• Evaluates search, status (ACTIVE, PROBATION, COMPLETED), and department filters.</w:t>
+        <w:br/>
+        <w:t>• Aggregates active sprint tasks, goal completion percentage averages, pending evidence counters, and active appraisal cycle status.</w:t>
+        <w:br/>
+        <w:t>• Verified by Postman: M-01 (Elena Rostova retrieves 82 assigned direct reports with HTTP 200).</w:t>
+      </w:r>
+    </w:p>
+    <w:p>
+      <w:pPr>
+        <w:keepNext/>
+        <w:spacing w:before="200" w:after="40"/>
+      </w:pPr>
+      <w:r>
+        <w:rPr>
+          <w:rFonts w:ascii="Calibri" w:hAnsi="Calibri"/>
+          <w:b/>
+          <w:color w:val="1A365D"/>
+          <w:sz w:val="23"/>
+        </w:rPr>
+        <w:t>3. tasks_views.py — [M-02] Assign Tasks &amp; [M-03] Manage Tasks &amp; Goals</w:t>
+      </w:r>
+    </w:p>
+    <w:p>
+      <w:pPr>
+        <w:spacing w:before="0" w:after="40" w:line="276" w:lineRule="auto"/>
+      </w:pPr>
+      <w:r>
+        <w:rPr>
+          <w:rFonts w:ascii="Calibri" w:hAnsi="Calibri"/>
+          <w:b/>
+          <w:color w:val="2D3748"/>
+          <w:sz w:val="21"/>
+        </w:rPr>
+        <w:t xml:space="preserve">Signature / Endpoint: </w:t>
+      </w:r>
+      <w:r>
+        <w:rPr>
+          <w:rFonts w:ascii="Calibri" w:hAnsi="Calibri"/>
+          <w:color w:val="2D3748"/>
+          <w:sz w:val="21"/>
+        </w:rPr>
+        <w:t>ManagerTasksView &amp; ManagerTaskDetailView | GET/POST /api/v1/manager/tasks/ &amp; PATCH .../&lt;id&gt;/status/</w:t>
+      </w:r>
+    </w:p>
+    <w:p>
+      <w:pPr>
+        <w:spacing w:before="0" w:after="120" w:line="276" w:lineRule="auto"/>
+      </w:pPr>
+      <w:r>
+        <w:rPr>
+          <w:rFonts w:ascii="Calibri" w:hAnsi="Calibri"/>
+          <w:b/>
+          <w:color w:val="2D3748"/>
+          <w:sz w:val="21"/>
+        </w:rPr>
+        <w:t xml:space="preserve">Implementation Details: </w:t>
+      </w:r>
+      <w:r>
+        <w:rPr>
+          <w:rFonts w:ascii="Calibri" w:hAnsi="Calibri"/>
+          <w:color w:val="2D3748"/>
+          <w:sz w:val="21"/>
+        </w:rPr>
+        <w:t>Complete task and milestone lifecycle management:</w:t>
+        <w:br/>
+        <w:t>• POST creates Goal entities categorized as 'TASK' assigned to a mentee, auto-generating an underlying KPI tracker and milestone notification.</w:t>
+        <w:br/>
+        <w:t>• GET filters team deliverables by status (NOT_STARTED, IN_PROGRESS, UNDER_REVIEW, COMPLETED) and priority.</w:t>
+        <w:br/>
+        <w:t>• PATCH updates progress percentages and allows mentors to review and approve finished deliverables.</w:t>
+        <w:br/>
+        <w:t>• Verified by Postman: M-02 (Assign Task HTTP 201) and M-03 (Manage Tasks HTTP 200).</w:t>
+      </w:r>
+    </w:p>
+    <w:p>
+      <w:pPr>
+        <w:keepNext/>
+        <w:spacing w:before="200" w:after="40"/>
+      </w:pPr>
+      <w:r>
+        <w:rPr>
+          <w:rFonts w:ascii="Calibri" w:hAnsi="Calibri"/>
+          <w:b/>
+          <w:color w:val="1A365D"/>
+          <w:sz w:val="23"/>
+        </w:rPr>
+        <w:t>4. technical_parameters_views.py — [M-04] Configure Technical Benchmarks</w:t>
+      </w:r>
+    </w:p>
+    <w:p>
+      <w:pPr>
+        <w:spacing w:before="0" w:after="40" w:line="276" w:lineRule="auto"/>
+      </w:pPr>
+      <w:r>
+        <w:rPr>
+          <w:rFonts w:ascii="Calibri" w:hAnsi="Calibri"/>
+          <w:b/>
+          <w:color w:val="2D3748"/>
+          <w:sz w:val="21"/>
+        </w:rPr>
+        <w:t xml:space="preserve">Signature / Endpoint: </w:t>
+      </w:r>
+      <w:r>
+        <w:rPr>
+          <w:rFonts w:ascii="Calibri" w:hAnsi="Calibri"/>
+          <w:color w:val="2D3748"/>
+          <w:sz w:val="21"/>
+        </w:rPr>
+        <w:t>ManagerTechnicalParametersView &amp; ManagerTechnicalParameterDetailView | GET/POST/PUT/DELETE /api/v1/manager/technical-parameters/</w:t>
+      </w:r>
+    </w:p>
+    <w:p>
+      <w:pPr>
+        <w:spacing w:before="0" w:after="120" w:line="276" w:lineRule="auto"/>
+      </w:pPr>
+      <w:r>
+        <w:rPr>
+          <w:rFonts w:ascii="Calibri" w:hAnsi="Calibri"/>
+          <w:b/>
+          <w:color w:val="2D3748"/>
+          <w:sz w:val="21"/>
+        </w:rPr>
+        <w:t xml:space="preserve">Implementation Details: </w:t>
+      </w:r>
+      <w:r>
+        <w:rPr>
+          <w:rFonts w:ascii="Calibri" w:hAnsi="Calibri"/>
+          <w:color w:val="2D3748"/>
+          <w:sz w:val="21"/>
+        </w:rPr>
+        <w:t>Defines and manages the organizational technical benchmark catalog:</w:t>
+        <w:br/>
+        <w:t>• Allows mentors to establish technical evaluation domains (e.g. API Security, Architecture, Clean Code).</w:t>
+        <w:br/>
+        <w:t>• Configures benchmark scores (1.0 - 5.0 scale) and relative weights for cycle evaluations.</w:t>
+        <w:br/>
+        <w:t>• Verified by Postman: M-04 (Create Benchmark Parameter HTTP 201).</w:t>
+      </w:r>
+    </w:p>
+    <w:p>
+      <w:pPr>
+        <w:keepNext/>
+        <w:spacing w:before="200" w:after="40"/>
+      </w:pPr>
+      <w:r>
+        <w:rPr>
+          <w:rFonts w:ascii="Calibri" w:hAnsi="Calibri"/>
+          <w:b/>
+          <w:color w:val="1A365D"/>
+          <w:sz w:val="23"/>
+        </w:rPr>
+        <w:t>5. technical_reviews_views.py — [M-05] Review Technical Capability Matrix</w:t>
+      </w:r>
+    </w:p>
+    <w:p>
+      <w:pPr>
+        <w:spacing w:before="0" w:after="40" w:line="276" w:lineRule="auto"/>
+      </w:pPr>
+      <w:r>
+        <w:rPr>
+          <w:rFonts w:ascii="Calibri" w:hAnsi="Calibri"/>
+          <w:b/>
+          <w:color w:val="2D3748"/>
+          <w:sz w:val="21"/>
+        </w:rPr>
+        <w:t xml:space="preserve">Signature / Endpoint: </w:t>
+      </w:r>
+      <w:r>
+        <w:rPr>
+          <w:rFonts w:ascii="Calibri" w:hAnsi="Calibri"/>
+          <w:color w:val="2D3748"/>
+          <w:sz w:val="21"/>
+        </w:rPr>
+        <w:t>ManagerTechnicalReviewsView | GET/POST /api/v1/manager/technical-reviews/</w:t>
+      </w:r>
+    </w:p>
+    <w:p>
+      <w:pPr>
+        <w:spacing w:before="0" w:after="120" w:line="276" w:lineRule="auto"/>
+      </w:pPr>
+      <w:r>
+        <w:rPr>
+          <w:rFonts w:ascii="Calibri" w:hAnsi="Calibri"/>
+          <w:b/>
+          <w:color w:val="2D3748"/>
+          <w:sz w:val="21"/>
+        </w:rPr>
+        <w:t xml:space="preserve">Implementation Details: </w:t>
+      </w:r>
+      <w:r>
+        <w:rPr>
+          <w:rFonts w:ascii="Calibri" w:hAnsi="Calibri"/>
+          <w:color w:val="2D3748"/>
+          <w:sz w:val="21"/>
+        </w:rPr>
+        <w:t>Multi-dimensional technical evaluation matrix:</w:t>
+        <w:br/>
+        <w:t>• Mentors score direct reports across all configured technical parameters (1–5 scale).</w:t>
+        <w:br/>
+        <w:t>• Records qualitative mentor observations, git commit hashes, and pull request URLs.</w:t>
+        <w:br/>
+        <w:t>• Automatically links submitted code evidence to the technical review score.</w:t>
+        <w:br/>
+        <w:t>• Verified by Postman: M-05 (Read &amp; Score Matrix HTTP 200).</w:t>
+      </w:r>
+    </w:p>
+    <w:p>
+      <w:pPr>
+        <w:keepNext/>
+        <w:spacing w:before="200" w:after="40"/>
+      </w:pPr>
+      <w:r>
+        <w:rPr>
+          <w:rFonts w:ascii="Calibri" w:hAnsi="Calibri"/>
+          <w:b/>
+          <w:color w:val="1A365D"/>
+          <w:sz w:val="23"/>
+        </w:rPr>
+        <w:t>6. evidence_views.py — [M-06] View &amp; Review Evidence Submissions</w:t>
+      </w:r>
+    </w:p>
+    <w:p>
+      <w:pPr>
+        <w:spacing w:before="0" w:after="40" w:line="276" w:lineRule="auto"/>
+      </w:pPr>
+      <w:r>
+        <w:rPr>
+          <w:rFonts w:ascii="Calibri" w:hAnsi="Calibri"/>
+          <w:b/>
+          <w:color w:val="2D3748"/>
+          <w:sz w:val="21"/>
+        </w:rPr>
+        <w:t xml:space="preserve">Signature / Endpoint: </w:t>
+      </w:r>
+      <w:r>
+        <w:rPr>
+          <w:rFonts w:ascii="Calibri" w:hAnsi="Calibri"/>
+          <w:color w:val="2D3748"/>
+          <w:sz w:val="21"/>
+        </w:rPr>
+        <w:t>ManagerEvidenceView &amp; ManagerEvidenceDecisionView | GET /api/v1/manager/evidence/ &amp; POST .../&lt;id&gt;/decision/</w:t>
+      </w:r>
+    </w:p>
+    <w:p>
+      <w:pPr>
+        <w:spacing w:before="0" w:after="120" w:line="276" w:lineRule="auto"/>
+      </w:pPr>
+      <w:r>
+        <w:rPr>
+          <w:rFonts w:ascii="Calibri" w:hAnsi="Calibri"/>
+          <w:b/>
+          <w:color w:val="2D3748"/>
+          <w:sz w:val="21"/>
+        </w:rPr>
+        <w:t xml:space="preserve">Implementation Details: </w:t>
+      </w:r>
+      <w:r>
+        <w:rPr>
+          <w:rFonts w:ascii="Calibri" w:hAnsi="Calibri"/>
+          <w:color w:val="2D3748"/>
+          <w:sz w:val="21"/>
+        </w:rPr>
+        <w:t>Deliverable verification and audit workflow:</w:t>
+        <w:br/>
+        <w:t>• Inspects artifacts submitted by mentees (documents, test reports, Figma URLs, repository links).</w:t>
+        <w:br/>
+        <w:t>• Records verification remarks, timestamp, reviewer identity, and formal decisions (APPROVED, REJECTED, REVISION_REQUESTED).</w:t>
+        <w:br/>
+        <w:t>• Verified by Postman: M-06 (Inspect Evidence HTTP 200).</w:t>
+      </w:r>
+    </w:p>
+    <w:p>
+      <w:pPr>
+        <w:keepNext/>
+        <w:spacing w:before="200" w:after="40"/>
+      </w:pPr>
+      <w:r>
+        <w:rPr>
+          <w:rFonts w:ascii="Calibri" w:hAnsi="Calibri"/>
+          <w:b/>
+          <w:color w:val="1A365D"/>
+          <w:sz w:val="23"/>
+        </w:rPr>
+        <w:t>7. feedback_views.py — [M-07] Continuous Feedback &amp; [M-08] Employee Reflections</w:t>
+      </w:r>
+    </w:p>
+    <w:p>
+      <w:pPr>
+        <w:spacing w:before="0" w:after="40" w:line="276" w:lineRule="auto"/>
+      </w:pPr>
+      <w:r>
+        <w:rPr>
+          <w:rFonts w:ascii="Calibri" w:hAnsi="Calibri"/>
+          <w:b/>
+          <w:color w:val="2D3748"/>
+          <w:sz w:val="21"/>
+        </w:rPr>
+        <w:t xml:space="preserve">Signature / Endpoint: </w:t>
+      </w:r>
+      <w:r>
+        <w:rPr>
+          <w:rFonts w:ascii="Calibri" w:hAnsi="Calibri"/>
+          <w:color w:val="2D3748"/>
+          <w:sz w:val="21"/>
+        </w:rPr>
+        <w:t>ManagerGiveFeedbackView &amp; ManagerEmployeeFeedbacksView | POST /api/v1/manager/feedback/ &amp; GET .../employee-feedbacks/</w:t>
+      </w:r>
+    </w:p>
+    <w:p>
+      <w:pPr>
+        <w:spacing w:before="0" w:after="120" w:line="276" w:lineRule="auto"/>
+      </w:pPr>
+      <w:r>
+        <w:rPr>
+          <w:rFonts w:ascii="Calibri" w:hAnsi="Calibri"/>
+          <w:b/>
+          <w:color w:val="2D3748"/>
+          <w:sz w:val="21"/>
+        </w:rPr>
+        <w:t xml:space="preserve">Implementation Details: </w:t>
+      </w:r>
+      <w:r>
+        <w:rPr>
+          <w:rFonts w:ascii="Calibri" w:hAnsi="Calibri"/>
+          <w:color w:val="2D3748"/>
+          <w:sz w:val="21"/>
+        </w:rPr>
+        <w:t>Continuous bi-directional feedback mechanism:</w:t>
+        <w:br/>
+        <w:t>• M-07 enables mentors to deliver structured feedback (PRAISE, COACHING, DELIVERY) with configurable visibility.</w:t>
+        <w:br/>
+        <w:t>• M-08 provides an aggregated feed of intern reflections, questions, and self-evaluations with mentor acknowledgment comments.</w:t>
+        <w:br/>
+        <w:t>• Verified by Postman: M-07 (Give Feedback HTTP 201) and M-08 (Review Reflections HTTP 200).</w:t>
+      </w:r>
+    </w:p>
+    <w:p>
+      <w:pPr>
+        <w:keepNext/>
+        <w:spacing w:before="200" w:after="40"/>
+      </w:pPr>
+      <w:r>
+        <w:rPr>
+          <w:rFonts w:ascii="Calibri" w:hAnsi="Calibri"/>
+          <w:b/>
+          <w:color w:val="1A365D"/>
+          <w:sz w:val="23"/>
+        </w:rPr>
+        <w:t>8. appraisal_views.py — [M-09] Conduct Appraisal, [M-10] Save Draft, [M-11] Submit</w:t>
+      </w:r>
+    </w:p>
+    <w:p>
+      <w:pPr>
+        <w:spacing w:before="0" w:after="40" w:line="276" w:lineRule="auto"/>
+      </w:pPr>
+      <w:r>
+        <w:rPr>
+          <w:rFonts w:ascii="Calibri" w:hAnsi="Calibri"/>
+          <w:b/>
+          <w:color w:val="2D3748"/>
+          <w:sz w:val="21"/>
+        </w:rPr>
+        <w:t xml:space="preserve">Signature / Endpoint: </w:t>
+      </w:r>
+      <w:r>
+        <w:rPr>
+          <w:rFonts w:ascii="Calibri" w:hAnsi="Calibri"/>
+          <w:color w:val="2D3748"/>
+          <w:sz w:val="21"/>
+        </w:rPr>
+        <w:t>ManagerAppraisalSubmissionsView, ManagerSaveAppraisalDraftView, ManagerSubmitAppraisalView | /api/v1/manager/appraisals/</w:t>
+      </w:r>
+    </w:p>
+    <w:p>
+      <w:pPr>
+        <w:spacing w:before="0" w:after="120" w:line="276" w:lineRule="auto"/>
+      </w:pPr>
+      <w:r>
+        <w:rPr>
+          <w:rFonts w:ascii="Calibri" w:hAnsi="Calibri"/>
+          <w:b/>
+          <w:color w:val="2D3748"/>
+          <w:sz w:val="21"/>
+        </w:rPr>
+        <w:t xml:space="preserve">Implementation Details: </w:t>
+      </w:r>
+      <w:r>
+        <w:rPr>
+          <w:rFonts w:ascii="Calibri" w:hAnsi="Calibri"/>
+          <w:color w:val="2D3748"/>
+          <w:sz w:val="21"/>
+        </w:rPr>
+        <w:t>End-to-end formal performance evaluation cycle:</w:t>
+        <w:br/>
+        <w:t>• M-09 loads the active appraisal form evaluating 5 core competencies (Problem Solving, Technical Competence, Code Quality, Velocity, Collaboration).</w:t>
+        <w:br/>
+        <w:t>• M-10 enables progressive draft saving with partial scores and notes to prevent data loss.</w:t>
+        <w:br/>
+        <w:t>• M-11 computes server-side weighted overall score and transitions status to SUBMITTED, locking the form.</w:t>
+        <w:br/>
+        <w:t>• Verified by Postman: M-09 (Load Form HTTP 200), M-10 (Save Draft HTTP 200), M-11 (Submit HTTP 200).</w:t>
+      </w:r>
+    </w:p>
+    <w:p>
+      <w:pPr>
+        <w:keepNext/>
+        <w:spacing w:before="200" w:after="40"/>
+      </w:pPr>
+      <w:r>
+        <w:rPr>
+          <w:rFonts w:ascii="Calibri" w:hAnsi="Calibri"/>
+          <w:b/>
+          <w:color w:val="1A365D"/>
+          <w:sz w:val="23"/>
+        </w:rPr>
+        <w:t>9. history_views.py — [M-12] Historical Reviews &amp; Retrospective Archive</w:t>
+      </w:r>
+    </w:p>
+    <w:p>
+      <w:pPr>
+        <w:spacing w:before="0" w:after="40" w:line="276" w:lineRule="auto"/>
+      </w:pPr>
+      <w:r>
+        <w:rPr>
+          <w:rFonts w:ascii="Calibri" w:hAnsi="Calibri"/>
+          <w:b/>
+          <w:color w:val="2D3748"/>
+          <w:sz w:val="21"/>
+        </w:rPr>
+        <w:t xml:space="preserve">Signature / Endpoint: </w:t>
+      </w:r>
+      <w:r>
+        <w:rPr>
+          <w:rFonts w:ascii="Calibri" w:hAnsi="Calibri"/>
+          <w:color w:val="2D3748"/>
+          <w:sz w:val="21"/>
+        </w:rPr>
+        <w:t>ManagerHistoricalReviewsView | GET /api/v1/manager/historical-reviews/</w:t>
+      </w:r>
+    </w:p>
+    <w:p>
+      <w:pPr>
+        <w:spacing w:before="0" w:after="120" w:line="276" w:lineRule="auto"/>
+      </w:pPr>
+      <w:r>
+        <w:rPr>
+          <w:rFonts w:ascii="Calibri" w:hAnsi="Calibri"/>
+          <w:b/>
+          <w:color w:val="2D3748"/>
+          <w:sz w:val="21"/>
+        </w:rPr>
+        <w:t xml:space="preserve">Implementation Details: </w:t>
+      </w:r>
+      <w:r>
+        <w:rPr>
+          <w:rFonts w:ascii="Calibri" w:hAnsi="Calibri"/>
+          <w:color w:val="2D3748"/>
+          <w:sz w:val="21"/>
+        </w:rPr>
+        <w:t>Longitudinal performance archive:</w:t>
+        <w:br/>
+        <w:t>• Retrieves historical appraisal cycles, ratings across criteria, reviewer comments, and score progression.</w:t>
+        <w:br/>
+        <w:t>• Enables mentors to compare growth over multiple quarters/semesters.</w:t>
+        <w:br/>
+        <w:t>• Verified by Postman: M-12 (Retrieve Historical Archive HTTP 200).</w:t>
+      </w:r>
+    </w:p>
+    <w:p>
+      <w:pPr>
+        <w:keepNext/>
+        <w:spacing w:before="200" w:after="40"/>
+      </w:pPr>
+      <w:r>
+        <w:rPr>
+          <w:rFonts w:ascii="Calibri" w:hAnsi="Calibri"/>
+          <w:b/>
+          <w:color w:val="1A365D"/>
+          <w:sz w:val="23"/>
+        </w:rPr>
+        <w:t>10. dashboard_views.py — Unified Manager Telemetry</w:t>
+      </w:r>
+    </w:p>
+    <w:p>
+      <w:pPr>
+        <w:spacing w:before="0" w:after="40" w:line="276" w:lineRule="auto"/>
+      </w:pPr>
+      <w:r>
+        <w:rPr>
+          <w:rFonts w:ascii="Calibri" w:hAnsi="Calibri"/>
+          <w:b/>
+          <w:color w:val="2D3748"/>
+          <w:sz w:val="21"/>
+        </w:rPr>
+        <w:t xml:space="preserve">Signature / Endpoint: </w:t>
+      </w:r>
+      <w:r>
+        <w:rPr>
+          <w:rFonts w:ascii="Calibri" w:hAnsi="Calibri"/>
+          <w:color w:val="2D3748"/>
+          <w:sz w:val="21"/>
+        </w:rPr>
+        <w:t>ManagerDashboardView | GET /api/v1/manager/dashboard/ &amp; /api/v1/manager/dashboard-summary/</w:t>
+      </w:r>
+    </w:p>
+    <w:p>
+      <w:pPr>
+        <w:spacing w:before="0" w:after="120" w:line="276" w:lineRule="auto"/>
+      </w:pPr>
+      <w:r>
+        <w:rPr>
+          <w:rFonts w:ascii="Calibri" w:hAnsi="Calibri"/>
+          <w:b/>
+          <w:color w:val="2D3748"/>
+          <w:sz w:val="21"/>
+        </w:rPr>
+        <w:t xml:space="preserve">Implementation Details: </w:t>
+      </w:r>
+      <w:r>
+        <w:rPr>
+          <w:rFonts w:ascii="Calibri" w:hAnsi="Calibri"/>
+          <w:color w:val="2D3748"/>
+          <w:sz w:val="21"/>
+        </w:rPr>
+        <w:t>Central telemetry dashboard:</w:t>
+        <w:br/>
+        <w:t>• Aggregates team size, completed reviews, pending reviews, pending evidence, team average score vs. company average.</w:t>
+        <w:br/>
+        <w:t>• Computes urgent deliverables and KPI progress for the active sprint.</w:t>
+        <w:br/>
+        <w:t>• Verified by Postman: DASH-01 (Telemetry Overview HTTP 200).</w:t>
+      </w:r>
+    </w:p>
+    <w:p>
+      <w:pPr>
+        <w:keepNext/>
+        <w:spacing w:before="200" w:after="40"/>
+      </w:pPr>
+      <w:r>
+        <w:rPr>
+          <w:rFonts w:ascii="Calibri" w:hAnsi="Calibri"/>
+          <w:b/>
+          <w:color w:val="1A365D"/>
+          <w:sz w:val="23"/>
+        </w:rPr>
+        <w:t>11. __init__.py &amp; views.py — Backward-Compatible Public Facade</w:t>
+      </w:r>
+    </w:p>
+    <w:p>
+      <w:pPr>
+        <w:spacing w:before="0" w:after="40" w:line="276" w:lineRule="auto"/>
+      </w:pPr>
+      <w:r>
+        <w:rPr>
+          <w:rFonts w:ascii="Calibri" w:hAnsi="Calibri"/>
+          <w:b/>
+          <w:color w:val="2D3748"/>
+          <w:sz w:val="21"/>
+        </w:rPr>
+        <w:t xml:space="preserve">Signature / Endpoint: </w:t>
+      </w:r>
+      <w:r>
+        <w:rPr>
+          <w:rFonts w:ascii="Calibri" w:hAnsi="Calibri"/>
+          <w:color w:val="2D3748"/>
+          <w:sz w:val="21"/>
+        </w:rPr>
+        <w:t>apps.manager.views.__init__ &amp; apps.manager.views</w:t>
+      </w:r>
+    </w:p>
+    <w:p>
+      <w:pPr>
+        <w:spacing w:before="0" w:after="120" w:line="276" w:lineRule="auto"/>
+      </w:pPr>
+      <w:r>
+        <w:rPr>
+          <w:rFonts w:ascii="Calibri" w:hAnsi="Calibri"/>
+          <w:b/>
+          <w:color w:val="2D3748"/>
+          <w:sz w:val="21"/>
+        </w:rPr>
+        <w:t xml:space="preserve">Implementation Details: </w:t>
+      </w:r>
+      <w:r>
+        <w:rPr>
+          <w:rFonts w:ascii="Calibri" w:hAnsi="Calibri"/>
+          <w:color w:val="2D3748"/>
+          <w:sz w:val="21"/>
+        </w:rPr>
+        <w:t>Re-exports all 11 modular views under the top-level package namespace, ensuring existing URLs and external imports continue functioning with zero breaking changes.</w:t>
+      </w:r>
     </w:p>
     <w:p>
       <w:pPr>

</xml_diff>